<commit_message>
Atualiza terceira entrega e roteiro com publicacao online
</commit_message>
<xml_diff>
--- a/docs/FinStart-3a-Entrega-Revisada.docx
+++ b/docs/FinStart-3a-Entrega-Revisada.docx
@@ -372,7 +372,7 @@
           <w:color w:val="000000"/>
           <w:sz w:val="24"/>
         </w:rPr>
-        <w:t>3ª entrega: consolidação da implementação — revisão de 28/10/2026.</w:t>
+        <w:t>3ª entrega: consolidação da implementação. Atualização da publicação em 29/10/2026.</w:t>
       </w:r>
     </w:p>
     <w:p>
@@ -516,7 +516,7 @@
           <w:color w:val="000000"/>
           <w:sz w:val="24"/>
         </w:rPr>
-        <w:t>A versão atual utiliza MySQL local em uma instância exclusiva da FinStart. O SQLite usado durante o desenvolvimento foi mantido como cópia de segurança e alternativa de execução. As evidências mostram funcionamento nos cenários verificados, sem afirmar que testes finitos garantem ausência de qualquer falha.</w:t>
+        <w:t>A versão publicada utiliza MySQL persistente na Aiven, API Node.js/Express no Render e interface na Vercel. A instância MySQL local documentada durante o desenvolvimento continua sendo uma alternativa independente. Seus dados pessoais não foram enviados ao banco online. SQLite permanece como alternativa local e de testes; a produção exige MySQL.</w:t>
       </w:r>
     </w:p>
     <w:p>
@@ -1414,7 +1414,7 @@
           <w:color w:val="000000"/>
           <w:sz w:val="24"/>
         </w:rPr>
-        <w:t>Concluído: fluxos do MVP, integração Express/API/JWT/SQL, MySQL exclusivo, biblioteca ampliada e verificações descritas na seção 6. Em andamento: conferência final do pacote e preparação da apresentação pelo grupo. A fazer: publicação no repositório com acesso de colaborador e envio no Canvas. O quadro datado está em docs/kanban.json.</w:t>
+        <w:t>Concluído: fluxos do MVP, integração Express/API/JWT/MySQL, biblioteca ampliada, publicação HTTPS na Vercel e Render, banco na Aiven e código atualizado no GitHub. Em andamento: revisão final da entrega e apresentação. Pendentes: automação dos próximos deploys pelo GitHub, conferência visual completa em produção e envio no Canvas. O quadro anterior em docs/kanban.json registra a revisão local de 28/10; este parágrafo atualiza a situação de publicação.</w:t>
       </w:r>
     </w:p>
     <w:p>
@@ -2570,7 +2570,7 @@
           <w:color w:val="000000"/>
           <w:sz w:val="24"/>
         </w:rPr>
-        <w:t>As projeções não descontam inflação, taxas ou tributos. Recuperação de senha, verificação de e-mail, produtos reais, cotações e hospedagem pública não estão implementados nesta versão.</w:t>
+        <w:t>As projeções não descontam inflação, taxas ou tributos. Recuperação de senha, verificação de e-mail, produtos reais e cotações não estão implementados. A hospedagem pública HTTPS já está disponível.</w:t>
       </w:r>
     </w:p>
     <w:p>
@@ -2646,7 +2646,7 @@
           <w:color w:val="000000"/>
           <w:sz w:val="24"/>
         </w:rPr>
-        <w:t>Navegador HTML/CSS/JavaScript → requisições fetch/JSON → Node.js 24 e Express → controllers → adaptador MySQL → banco relacional. O navegador não recebe credenciais SQL nem lê arquivos do banco. A arquitetura é um monólito em camadas, adequado à demonstração e à organização atual do projeto.</w:t>
+        <w:t>Na publicação, o navegador carrega HTML/CSS/JavaScript da Vercel e envia fetch/JSON para /api no mesmo domínio. O proxy encaminha a requisição ao Node.js 24/Express no Render; controllers acessam o MySQL da Aiven por conexão TLS. O navegador não recebe credenciais SQL. O backend mantém organização em camadas; a infraestrutura distribui frontend, aplicação e banco.</w:t>
       </w:r>
     </w:p>
     <w:p>
@@ -3714,7 +3714,7 @@
           <w:color w:val="000000"/>
           <w:sz w:val="24"/>
         </w:rPr>
-        <w:t>O MySQL Server existente estava ativo, mas sua senha administrativa não estava disponível. Foi criada uma instância exclusiva da FinStart, acessível somente em 127.0.0.1:3308, preservando o serviço anterior. A aplicação usa finstart_app restrito ao banco finstart; há um usuário separado de leitura para inspeção no Workbench.</w:t>
+        <w:t>Durante o desenvolvimento, foi criada uma instância MySQL exclusiva em 127.0.0.1:3308, preservando o serviço anterior e seus dados. Essa configuração local não é o banco usado pelo endereço público. Na publicação, o backend conecta ao MySQL da Aiven com variáveis privadas e validação do certificado TLS; contas locais e online são independentes.</w:t>
       </w:r>
     </w:p>
     <w:p>
@@ -3738,7 +3738,7 @@
           <w:color w:val="000000"/>
           <w:sz w:val="24"/>
         </w:rPr>
-        <w:t>Antes da troca, foi gerado backup do SQLite. A migração copiou registros mantendo IDs, hashes de senha e relacionamentos, comparou todos os campos originais e confirmou as contagens antes do commit. O catálogo educativo foi atualizado em seguida. Mudar apenas DB_DRIVER não realiza essa transferência: o procedimento utilizado está em scripts/configurar-mysql-local.js.</w:t>
+        <w:t>Na migração local, um backup SQLite foi preservado e os registros foram copiados com IDs, hashes e relacionamentos conferidos. O procedimento está em scripts/configurar-mysql-local.js. Essa migração histórica não transferiu contas para a Aiven.</w:t>
       </w:r>
     </w:p>
     <w:p>
@@ -6138,7 +6138,7 @@
           <w:color w:val="000000"/>
           <w:sz w:val="24"/>
         </w:rPr>
-        <w:t>Na revisão de 28/10/2026, dez testes locais foram aprovados. A integração MySQL foi executada separadamente e aprovada; na execução comum ela é ignorada quando não configurada. Os testes usam dados fictícios e banco isolado, evitando alterar contas reais. Os resultados não constituem auditoria de segurança de produção.</w:t>
+        <w:t>A revisão local de 28/10 registrou dez testes aprovados e integração MySQL separada. Na preparação de produção, a suíte registrou 11 testes aprovados e um teste MySQL opcional ignorado. Em 29/10, scripts/verificar-online.mjs foi executado contra o domínio público da Vercel, exercitando proxy, API e MySQL reais com contas fictícias. Os resultados abaixo distinguem a verificação local das evidências online; não constituem auditoria completa de segurança.</w:t>
       </w:r>
     </w:p>
     <w:tbl>
@@ -6891,6 +6891,86 @@
     </w:p>
     <w:p>
       <w:pPr>
+        <w:spacing w:after="120"/>
+      </w:pPr>
+      <w:r>
+        <w:rPr>
+          <w:rFonts w:ascii="Arial" w:hAnsi="Arial"/>
+          <w:sz w:val="24"/>
+        </w:rPr>
+        <w:t>Verificação da publicação em 29/10/2026</w:t>
+      </w:r>
+    </w:p>
+    <w:p>
+      <w:pPr>
+        <w:spacing w:after="120"/>
+      </w:pPr>
+      <w:r>
+        <w:rPr>
+          <w:rFonts w:ascii="Arial" w:hAnsi="Arial"/>
+          <w:sz w:val="24"/>
+        </w:rPr>
+        <w:t>Passaram pelo domínio da Vercel: acesso público, conexão MySQL, cadastro, login, cookie Secure/HttpOnly/SameSite=Strict, cálculo de juros, gravação e consulta de orçamento/juros/metas, atualização e histórico de progresso, comparação e histórico, conteúdos, isolamento entre duas contas, logout e recuperação dos dados em novo login. Os registros financeiros de teste foram excluídos; duas contas fictícias permaneceram.</w:t>
+      </w:r>
+    </w:p>
+    <w:p>
+      <w:pPr>
+        <w:spacing w:after="120"/>
+      </w:pPr>
+      <w:r>
+        <w:rPr>
+          <w:rFonts w:ascii="Arial" w:hAnsi="Arial"/>
+          <w:sz w:val="24"/>
+        </w:rPr>
+        <w:t>Os caminhos /.env, /server/index.js e /database/schema.mysql.sql retornaram 404 no frontend. No navegador, o botão de projeção exibiu saldo de R$ 6.213,55. O teste HTTP não substitui a revisão de todos os formulários no navegador. Nesta publicação, ainda não foram testados todos os fluxos visuais/mobile nem a persistência após reinício do servidor. Os testes responsivos anteriores são evidências locais.</w:t>
+      </w:r>
+    </w:p>
+    <w:p>
+      <w:pPr>
+        <w:keepNext/>
+      </w:pPr>
+      <w:r>
+        <w:drawing>
+          <wp:inline xmlns:a="http://schemas.openxmlformats.org/drawingml/2006/main" xmlns:pic="http://schemas.openxmlformats.org/drawingml/2006/picture">
+            <wp:extent cx="3240000" cy="7681234"/>
+            <wp:docPr id="58" name="Picture 58"/>
+            <wp:cNvGraphicFramePr>
+              <a:graphicFrameLocks noChangeAspect="1"/>
+            </wp:cNvGraphicFramePr>
+            <a:graphic>
+              <a:graphicData uri="http://schemas.openxmlformats.org/drawingml/2006/picture">
+                <pic:pic>
+                  <pic:nvPicPr>
+                    <pic:cNvPr id="0" name="juros-online.png"/>
+                    <pic:cNvPicPr/>
+                  </pic:nvPicPr>
+                  <pic:blipFill>
+                    <a:blip r:embed="rId16"/>
+                    <a:stretch>
+                      <a:fillRect/>
+                    </a:stretch>
+                  </pic:blipFill>
+                  <pic:spPr>
+                    <a:xfrm>
+                      <a:off x="0" y="0"/>
+                      <a:ext cx="3240000" cy="7681234"/>
+                    </a:xfrm>
+                    <a:prstGeom prst="rect"/>
+                  </pic:spPr>
+                </pic:pic>
+              </a:graphicData>
+            </a:graphic>
+          </wp:inline>
+        </w:drawing>
+      </w:r>
+    </w:p>
+    <w:p>
+      <w:r>
+        <w:t>Figura 6 - Projeção calculada no site público da Vercel em 29/10/2026. Evidência: docs/juros-online.png.</w:t>
+      </w:r>
+    </w:p>
+    <w:p>
+      <w:pPr>
         <w:keepNext/>
         <w:pageBreakBefore w:val="0"/>
         <w:spacing w:before="280" w:beforeAutospacing="1" w:after="100" w:afterAutospacing="1" w:line="240" w:lineRule="auto"/>
@@ -6938,7 +7018,7 @@
           <w:color w:val="000000"/>
           <w:sz w:val="24"/>
         </w:rPr>
-        <w:t>A implantação desta entrega é local. Na instalação demonstrada, INICIAR-FINSTART.cmd prepara e verifica o MySQL exclusivo e o servidor web, abrindo http://127.0.0.1:3000. Abrir index.html como arquivo não inicia a API; por isso os formulários são bloqueados nesse modo e orientam a abertura correta.</w:t>
+        <w:t>A apresentação utiliza https://finstart-publicacao.vercel.app. Basta internet e navegador; não é necessário instalar Node.js, MySQL ou abrir terminal no computador do professor. O frontend está na Vercel, a API em https://finstart-api-l60v.onrender.com e o banco persistente na Aiven. GET /api/saude pelo domínio do site confirmou banco conectado em 29/10/2026.</w:t>
       </w:r>
     </w:p>
     <w:p>
@@ -6962,7 +7042,7 @@
           <w:color w:val="000000"/>
           <w:sz w:val="24"/>
         </w:rPr>
-        <w:t>Em outro computador: instalar Node.js 24+ e MySQL Server compatível; instalar as dependências; executar a configuração local com o site parado; iniciar a aplicação. Para usar um servidor MySQL administrado pelo grupo, criar banco e usuário próprios e configurar o .env. O README descreve as duas opções. O pacote sem configuração privada inicia em SQLite; a opção MySQL requer preparação explícita.</w:t>
+        <w:t>A Vercel publica somente os arquivos selecionados por scripts/build-static.js. vercel.json define o proxy /api para o Render e cabeçalhos de segurança. O Render executa pnpm install --frozen-lockfile e node server/index.js. server/index.js usa PORT e HOST=0.0.0.0 em produção; PUBLIC_ORIGIN limita a origem aceita. A conexão TLS está em server/mysql.js e o esquema em database/schema.mysql.sql.</w:t>
       </w:r>
     </w:p>
     <w:p>
@@ -6986,7 +7066,7 @@
           <w:color w:val="000000"/>
           <w:sz w:val="24"/>
         </w:rPr>
-        <w:t>O Workbench é um cliente de administração. Abrir schema.mysql.sql mostra o código, mas não cria conexão nem executa as tabelas automaticamente. A conexão da instalação local usa 127.0.0.1, porta 3308 e banco finstart. A senha privada fica somente na pasta data da máquina, fora do relatório, Git e ZIP.</w:t>
+        <w:t>No Render, NODE_ENV=production, DB_DRIVER=mysql e DB_SSL=true identificam a configuração. DB_HOST, DB_PORT, DB_NAME, DB_USER, DB_PASSWORD, DB_SSL_CA e JWT_SECRET ficam nas variáveis privadas. Nenhuma senha deve ser mostrada na apresentação ou incluída no ZIP. O Workbench é opcional para inspeção autorizada do banco; abrir um arquivo SQL sozinho apenas mostra o código.</w:t>
       </w:r>
     </w:p>
     <w:p>
@@ -7034,7 +7114,7 @@
           <w:color w:val="000000"/>
           <w:sz w:val="24"/>
         </w:rPr>
-        <w:t>O utilitário de backup exporta SQLite ou MySQL conforme o driver configurado. O backup MySQL usa mysqldump com transação consistente. Backups e credenciais devem ficar privados. O Git e o ZIP compartilham código, SQL, testes, documentos e evidências, não contas reais ou diretórios do banco.</w:t>
+        <w:t>GitHub e ZIP preservam código, scripts SQL, testes e documentos. Não contêm contas reais, senhas ou uma cópia dos dados em nuvem. O banco online é independente do pacote de código. Os utilitários locais de backup permanecem disponíveis; a configuração e restauração de backup externo da Aiven ainda não foram verificadas nesta publicação.</w:t>
       </w:r>
     </w:p>
     <w:p>
@@ -7058,7 +7138,7 @@
           <w:color w:val="000000"/>
           <w:sz w:val="24"/>
         </w:rPr>
-        <w:t>Não há publicação Firebase, banco centralizado em nuvem ou HTTPS público nesta versão. A publicação do código depende de acesso de colaborador ao repositório do grupo. O envio no Canvas e a apresentação oral devem ser feitos pelo grupo após conferir os arquivos.</w:t>
+        <w:t>O repositório oficial é https://github.com/enzocayresferreira7-pixel/finstart. O frontend foi publicado pela CLI a partir de pasta estática; a atualização automática por novos commits ainda precisa ser configurada e verificada. O plano gratuito do Render pode exigir espera no primeiro acesso após inatividade. O frontend aguarda até 90 segundos, sem repetir gravações automaticamente. Antes da apresentação, abrir o site e conferir /api/saude.</w:t>
       </w:r>
     </w:p>
     <w:p>
@@ -7763,7 +7843,7 @@
           <w:color w:val="000000"/>
           <w:sz w:val="24"/>
         </w:rPr>
-        <w:t>Próximos passos: recuperação de senha e verificação de e-mail; testes com usuários e acessibilidade assistiva; hospedagem com HTTPS e backup externo; acompanhamento de erros; revisão periódica das fontes; eventual integração com dados reais. Produtos financeiros e rentabilidades atuais não devem ser confundidos com os cenários hipotéticos existentes.</w:t>
+        <w:t>Próximos passos: concluir deploy automático pelo GitHub; conferir todos os fluxos visuais e mobile em produção; testar persistência após reinício controlado da API; configurar e testar backup externo; recuperação de senha e verificação de e-mail; testes com usuários e acessibilidade assistiva; monitoramento e revisão periódica das fontes. Os cenários financeiros continuam hipotéticos.</w:t>
       </w:r>
     </w:p>
     <w:p>
@@ -8469,7 +8549,7 @@
           <w:color w:val="000000"/>
           <w:sz w:val="24"/>
         </w:rPr>
-        <w:t>Pendências de entrega: revisão final pelo grupo, publicação com permissão no GitHub, upload do PDF no Canvas e apresentação oral. A verificação técnica não garante nota nem substitui a avaliação do professor.</w:t>
+        <w:t>Pendências de entrega: revisão do documento pelo grupo, upload no Canvas e apresentação oral. Código e aplicação já estão publicados. Permanecem as verificações e melhorias descritas nas seções 6 a 8; testes finitos não garantem ausência de falhas nem substituem a avaliação do professor.</w:t>
       </w:r>
     </w:p>
     <w:sectPr>

</xml_diff>